<commit_message>
Distrito Federal: redação revisada pela coordenação em 13 frases de 12 fatores (retirada de declarações de lacuna)
Co-Authored-By: Claude Opus 5.5 <noreply@anthropic.com>
Claude-Session: https://claude.ai/code/session_01DaExKAnWXMvYMevoj2HpBX
</commit_message>
<xml_diff>
--- a/territorios/fontes/Diagnostico_Situacional_DistritoFederal_RAs_Matriz_v1.0.2.docx
+++ b/territorios/fontes/Diagnostico_Situacional_DistritoFederal_RAs_Matriz_v1.0.2.docx
@@ -2776,24 +2776,12 @@
         <w:jc w:val="both"/>
       </w:pPr>
       <w:r>
-        <w:t xml:space="preserve">O cuidado com crianças e grupos vulneráveis no Distrito Federal é condicionado pela estrutura etária desigual entre as Regiões Administrativas: a PDAD 2021 registrou idade média de 30,6 anos no grupo de renda baixa, que reúne </w:t>
+        <w:t>O cuidado com crianças e grupos vulneráveis no Distrito Federal é condicionado pela estrutura etária desigual entre as Regiões Administrativas: a PDAD 2021 registrou idade média de 30,6 anos no grupo de renda baixa, que reúne RAs como SCIA-Estrutural, Sol Nascente/Pôr do Sol, Itapoã, Paranoá e Recanto das Emas, contra 37,6 anos no grupo de renda alta (IPEDF). A maior proporção de crianças coincide, portanto, com os territórios de menor renda e de menor oferta de creches, o que transfere o cuidado às famílias e, nelas, às mulheres. O IBGE registra 354.373 matrículas no ensino fundamental em 2025 (IBGE Estados). O fator articula-se a E1-F07, E3-F09, E5-F04 e E3-F14, e o plano popular deve priorizar a oferta de creches e de cuidado comunitário nas RAs de renda baixa, com vigilância de situações de negligência articulada à APS.</w:t>
       </w:r>
       <w:proofErr w:type="spellStart"/>
-      <w:r>
-        <w:t>RAs</w:t>
-      </w:r>
       <w:proofErr w:type="spellEnd"/>
-      <w:r>
-        <w:t xml:space="preserve"> como SCIA-Estrutural, Sol Nascente/Pôr do Sol, Itapoã, Paranoá e Recanto das Emas, contra 37,6 anos no grupo de renda alta (IPEDF). A maior proporção de crianças coincide, portanto, com os territórios de menor renda e de menor oferta de creches, o que transfere o cuidado às famílias e, nelas, às mulheres. O IBGE registra 354.373 matrículas no ensino fundamental em 2025 (IBGE Estados), mas a cobertura de educação infantil por RA não foi sistematizada nesta versão. O fator articula-se a E1-F07, E3-F09, E5-F04 e E3-F14, e o plano popular deve priorizar a oferta de creches e de cuidado comunitário nas </w:t>
-      </w:r>
       <w:proofErr w:type="spellStart"/>
-      <w:r>
-        <w:t>RAs</w:t>
-      </w:r>
       <w:proofErr w:type="spellEnd"/>
-      <w:r>
-        <w:t xml:space="preserve"> de renda baixa, com vigilância de situações de negligência articulada à APS.</w:t>
-      </w:r>
     </w:p>
     <w:tbl>
       <w:tblPr>
@@ -6762,24 +6750,12 @@
         <w:jc w:val="both"/>
       </w:pPr>
       <w:r>
-        <w:t xml:space="preserve">O crédito para micro e pequenas empresas e cooperativas no Distrito Federal é oferecido pelo Banco de Brasília, por programas distritais de microcrédito e pelos bancos públicos federais, mas o acesso é limitado para empreendedores informais das </w:t>
+        <w:t>O crédito para micro e pequenas empresas e cooperativas no Distrito Federal é oferecido pelo Banco de Brasília, por programas distritais de microcrédito e pelos bancos públicos federais, mas o acesso é limitado para empreendedores informais das RAs periféricas, que não dispõem de garantias, histórico de crédito ou formalização. As cooperativas de catadores e da agricultura familiar dependem de linhas específicas, como o Pronaf. A taxa de informalidade de 27,3% em 2025 (IBGE, PNAD Contínua), embora baixa na comparação nacional, corresponde a contingente expressivo de trabalhadores fora do crédito produtivo. O fator articula-se a E1-F20, E1-F10, E1-F11 e E1-F29, e o plano popular pode propor fundos rotativos comunitários, a ampliação do microcrédito orientado nas RAs de renda baixa e a articulação entre crédito e assistência técnica para empreendimentos solidários.</w:t>
       </w:r>
       <w:proofErr w:type="spellStart"/>
-      <w:r>
-        <w:t>RAs</w:t>
-      </w:r>
       <w:proofErr w:type="spellEnd"/>
-      <w:r>
-        <w:t xml:space="preserve"> periféricas, que não dispõem de garantias, histórico de crédito ou formalização. As cooperativas de catadores e da agricultura familiar dependem de linhas específicas, como o Pronaf, cuja execução por RA não foi sistematizada nesta versão. A taxa de informalidade de 27,3% em 2025 (IBGE, PNAD Contínua), embora baixa na comparação nacional, corresponde a contingente expressivo de trabalhadores fora do crédito produtivo. O fator articula-se a E1-F20, E1-F10, E1-F11 e E1-F29, e o plano popular pode propor fundos rotativos comunitários, a ampliação do microcrédito orientado nas </w:t>
-      </w:r>
       <w:proofErr w:type="spellStart"/>
-      <w:r>
-        <w:t>RAs</w:t>
-      </w:r>
       <w:proofErr w:type="spellEnd"/>
-      <w:r>
-        <w:t xml:space="preserve"> de renda baixa e a articulação entre crédito e assistência técnica para empreendimentos solidários.</w:t>
-      </w:r>
     </w:p>
     <w:tbl>
       <w:tblPr>
@@ -7534,7 +7510,7 @@
         <w:jc w:val="both"/>
       </w:pPr>
       <w:r>
-        <w:t>Os sistemas sustentáveis de produção de alimentos no Distrito Federal dependem da proteção das áreas rurais e dos mananciais. A bacia do Descoberto, que abastecia cerca de 1,8 milhão de pessoas na crise hídrica de 2017, combina produção agrícola intensiva, ocupação urbana irregular e captação para abastecimento (Caesb, conforme Congresso em Foco), o que torna a conversão para práticas conservacionistas uma questão de saúde pública. A seca de 164 dias sem chuva em 2024, recorde da série do INMET, evidenciou a vulnerabilidade hídrica da agricultura irrigada. Programas de pagamento por serviços ambientais a produtores, como o Produtor de Água na bacia do Pipiripau, são experiências relevantes cuja escala não foi quantificada nesta versão. O fator articula-se a E1-F05, E4-F04, E2-F30 e E1-F03, e o plano popular deve apoiar a transição agroecológica nas bacias de abastecimento e a expansão dos programas de serviços ambientais.</w:t>
+        <w:t>Os sistemas sustentáveis de produção de alimentos no Distrito Federal dependem da proteção das áreas rurais e dos mananciais. A bacia do Descoberto, que abastecia cerca de 1,8 milhão de pessoas na crise hídrica de 2017, combina produção agrícola intensiva, ocupação urbana irregular e captação para abastecimento (Caesb, conforme Congresso em Foco), o que torna a conversão para práticas conservacionistas uma questão de saúde pública. A seca de 164 dias sem chuva em 2024, recorde da série do INMET, evidenciou a vulnerabilidade hídrica da agricultura irrigada. Programas de pagamento por serviços ambientais a produtores, como o Produtor de Água na bacia do Pipiripau, são experiências relevantes. O fator articula-se a E1-F05, E4-F04, E2-F30 e E1-F03, e o plano popular deve apoiar a transição agroecológica nas bacias de abastecimento e a expansão dos programas de serviços ambientais.</w:t>
       </w:r>
     </w:p>
     <w:tbl>
@@ -13004,34 +12980,12 @@
         <w:jc w:val="both"/>
       </w:pPr>
       <w:r>
-        <w:t xml:space="preserve">As rotas de fuga no Distrito Federal são pouco definidas para os riscos que caracterizam o território, como alagamentos súbitos, deslizamentos em encostas e erosões, e incêndios florestais que avançam sobre áreas </w:t>
-      </w:r>
-      <w:r>
-        <w:lastRenderedPageBreak/>
-        <w:t xml:space="preserve">urbanas contíguas a unidades de conservação. Nas </w:t>
+        <w:t>As rotas de fuga no Distrito Federal são pouco definidas para os riscos que caracterizam o território, como alagamentos súbitos, deslizamentos em encostas e erosões, e incêndios florestais que avançam sobre áreas urbanas contíguas a unidades de conservação. Nas RAs de ocupação irregular, como Sol Nascente/Pôr do Sol, Fercal e Sobradinho II, o traçado viário estreito e a ausência de drenagem dificultam a evacuação em chuvas intensas. As áreas próximas ao Parque Nacional de Brasília, à Floresta Nacional e à Estação Ecológica de Águas Emendadas exigem rotas definidas para incêndios. Inexistência de planos de evacuação comunitários por área de risco nos registros consultados. O fator articula-se a E2-F33, E2-F39, E2-F37 e E2-F32, e o plano popular deve definir e sinalizar, com moradores e a Defesa Civil, rotas de fuga nas 22 áreas de risco monitoradas e nas bordas urbanas das unidades de conservação.</w:t>
       </w:r>
       <w:proofErr w:type="spellStart"/>
-      <w:r>
-        <w:t>RAs</w:t>
-      </w:r>
       <w:proofErr w:type="spellEnd"/>
-      <w:r>
-        <w:t xml:space="preserve"> de ocupação irregular, como Sol Nascente/Pôr do Sol, </w:t>
-      </w:r>
       <w:proofErr w:type="spellStart"/>
-      <w:r>
-        <w:t>Fercal</w:t>
-      </w:r>
       <w:proofErr w:type="spellEnd"/>
-      <w:r>
-        <w:t xml:space="preserve"> e Sobradinho II, o traçado viário estreito e a ausência de drenagem dificultam a evacuação em chuvas intensas. As áreas próximas ao Parque Nacional de Brasília, à </w:t>
-      </w:r>
-      <w:r>
-        <w:t>Floresta Nacional e à Estação Ecológica de Águas Emendadas exigem rotas definidas para incêndios. A inexistência de planos de evacuação comunitários por área de risco nos registros consultados configura lacuna. O</w:t>
-      </w:r>
-      <w:r>
-        <w:t xml:space="preserve"> fator articula-se a E2-F33, E2-F39, E2-F37 e E2-F32, e o plano popular deve definir e sinalizar, com moradores e a Defesa Civil, rotas de fuga nas 22 áreas de risco monitoradas e nas bordas urbanas das unidades de conservação.</w:t>
-      </w:r>
     </w:p>
     <w:tbl>
       <w:tblPr>
@@ -15070,16 +15024,10 @@
         <w:jc w:val="both"/>
       </w:pPr>
       <w:r>
-        <w:t xml:space="preserve">As sirenes e alertas de emergências no Distrito Federal baseiam-se principalmente no envio de mensagens por SMS e </w:t>
+        <w:t>As sirenes e alertas de emergências no Distrito Federal baseiam-se principalmente no envio de mensagens por SMS e cell broadcast pela Defesa Civil, nos alertas meteorológicos do INMET e em comunicados à imprensa. O INMET emitiu alertas vermelhos por baixa umidade durante a seca de 2024 (INMET). Não foram identificados sistemas de sirenes em áreas de risco do DF nos registros consultados. Para riscos de evolução rápida, como alagamentos e incêndios em bordas urbanas, a efetividade do alerta depende de redes locais que transformem a informação em ação. Alertas de qualidade do ar ainda não integram rotina pública acessível. O fator articula-se a E2-F29, E6-F11, E6-F03 e E2-F32, e o plano popular deve estruturar cadeia comunitária de alertas, com pontos focais por área de risco e orientações específicas para calor, fumaça e chuvas intensas.</w:t>
       </w:r>
       <w:proofErr w:type="spellStart"/>
-      <w:r>
-        <w:t>cell</w:t>
-      </w:r>
       <w:proofErr w:type="spellEnd"/>
-      <w:r>
-        <w:t xml:space="preserve"> broadcast pela Defesa Civil, nos alertas meteorológicos do INMET e em comunicados à imprensa. O INMET emitiu alertas vermelhos por baixa umidade durante a seca de 2024 (INMET). Não foram identificados sistemas de sirenes em áreas de risco do DF nos registros consultados, e a cobertura do cadastro de alertas por SMS por RA não foi sistematizada nesta versão. Para riscos de evolução rápida, como alagamentos e incêndios em bordas urbanas, a efetividade do alerta depende de redes locais que transformem a informação em ação. Alertas de qualidade do ar ainda não integram rotina pública acessível. O fator articula-se a E2-F29, E6-F11, E6-F03 e E2-F32, e o plano popular deve estruturar cadeia comunitária de alertas, com pontos focais por área de risco e orientações específicas para calor, fumaça e chuvas intensas.</w:t>
-      </w:r>
     </w:p>
     <w:tbl>
       <w:tblPr>
@@ -18895,11 +18843,7 @@
         <w:jc w:val="both"/>
       </w:pPr>
       <w:r>
-        <w:t xml:space="preserve">A igualdade racial no Distrito Federal requer enfrentar desigualdades que se reproduzem no trabalho, na renda e no território. Em 2023, pessoas negras eram 62,0% da população economicamente ativa, mas tinham taxa de desemprego de 17,9%, contra 13,5% entre não negras, e rendimento médio de R$ 3.569, contra R$ 6.221, razão que piorou de 61,7% em 2022 para 57,4% em 2023 (IPEDF e DIEESE, PED-DF). O DF possui órgão distrital de promoção da igualdade racial e conselho de participação, mas os indicadores de saúde desagregados por raça e cor por região de saúde, como mortalidade materna e infantil, não foram </w:t>
-      </w:r>
-      <w:r>
-        <w:lastRenderedPageBreak/>
-        <w:t>sistematizados nesta versão. A população quilombola do DF, 97,05% urbana segundo o Censo 2022 (IBGE, conforme Correio da Manhã), tem baixa visibilidade nas políticas. O fator articula-se a E3-F16, E3-F17, E3-F19 e E1-F18, e o plano popular deve adotar metas de redução das desigualdades raciais por RA.</w:t>
+        <w:t>A igualdade racial no Distrito Federal requer enfrentar desigualdades que se reproduzem no trabalho, na renda e no território. Em 2023, pessoas negras eram 62,0% da população economicamente ativa, mas tinham taxa de desemprego de 17,9%, contra 13,5% entre não negras, e rendimento médio de R$ 3.569, contra R$ 6.221, razão que piorou de 61,7% em 2022 para 57,4% em 2023 (IPEDF e DIEESE, PED-DF). O DF possui órgão distrital de promoção da igualdade racial e conselho de participação. A população quilombola do DF, 97,05% urbana segundo o Censo 2022 (IBGE, conforme Correio da Manhã), tem baixa visibilidade nas políticas. O fator articula-se a E3-F16, E3-F17, E3-F19 e E1-F18, e o plano popular deve adotar metas de redução das desigualdades raciais por RA.</w:t>
       </w:r>
     </w:p>
     <w:tbl>
@@ -19465,7 +19409,7 @@
         <w:jc w:val="both"/>
       </w:pPr>
       <w:r>
-        <w:t>O acesso a recursos financeiros para gestão e conservação da biodiversidade no Distrito Federal combina recursos de compensação ambiental de empreendimentos, o orçamento do Ibram, recursos federais do ICMBio para as unidades de conservação federais, como o Parque Nacional de Brasília e a Floresta Nacional, e programas de pagamento por serviços ambientais. A pressão sobre o Cerrado remanescente, com desmatamento de 638 hectares em 2023, ante 90 hectares em 2022 (MapBiomas, RAD 2023), indica que os recursos de fiscalização e conservação não acompanham a velocidade da conversão. O DF realizou receitas de R$ 42,81 bilhões em 2025 (IBGE, finanças públicas), mas a parcela destinada à gestão ambiental por RA e unidade de conservação não foi sistematizada nesta versão. O fator articula-se a E4-F16, E4-F22, E6-F09 e E4-F25, e o plano popular deve demandar transparência na aplicação dos recursos de compensação ambiental e sua destinação a áreas de recarga e mananciais.</w:t>
+        <w:t>O acesso a recursos financeiros para gestão e conservação da biodiversidade no Distrito Federal combina recursos de compensação ambiental de empreendimentos, o orçamento do Ibram, recursos federais do ICMBio para as unidades de conservação federais, como o Parque Nacional de Brasília e a Floresta Nacional, e programas de pagamento por serviços ambientais. A pressão sobre o Cerrado remanescente, com desmatamento de 638 hectares em 2023, ante 90 hectares em 2022 (MapBiomas, RAD 2023), indica que os recursos de fiscalização e conservação não acompanham a velocidade da conversão. O DF realizou receitas de R$ 42,81 bilhões em 2025 (IBGE, finanças públicas), mas a parcela destinada à gestão ambiental por RA e unidade de conservação não foi identificada nas bases públicas consultadas. O fator articula-se a E4-F16, E4-F22, E6-F09 e E4-F25, e o plano popular deve demandar transparência na aplicação dos recursos de compensação ambiental e sua destinação a áreas de recarga e mananciais.</w:t>
       </w:r>
     </w:p>
     <w:tbl>
@@ -21321,16 +21265,10 @@
         <w:jc w:val="both"/>
       </w:pPr>
       <w:r>
-        <w:t xml:space="preserve">A educação ambiental e para adaptação climática no Distrito Federal é desenvolvida pela rede pública de ensino, pelo Ibram, pelas unidades de conservação e por organizações da sociedade civil, com programas sobre água, Cerrado, resíduos e prevenção de incêndios. A seca recorde de 2024, a epidemia de dengue do mesmo ano e a crise hídrica de 2017 constituem experiências coletivas recentes que podem ser mobilizadas pedagogicamente como temas geradores, na perspectiva freireana da PICAPS. A educação climática ainda não está integrada de modo sistemático ao currículo das escolas das </w:t>
+        <w:t>A educação ambiental e para adaptação climática no Distrito Federal é desenvolvida pela rede pública de ensino, pelo Ibram, pelas unidades de conservação e por organizações da sociedade civil, com programas sobre água, Cerrado, resíduos e prevenção de incêndios. A seca recorde de 2024, a epidemia de dengue do mesmo ano e a crise hídrica de 2017 constituem experiências coletivas recentes que podem ser mobilizadas pedagogicamente como temas geradores, na perspectiva freireana da PICAPS. A educação climática ainda não está integrada de modo sistemático ao currículo das escolas das RAs mais expostas. As escolas, com 354.373 matrículas no ensino fundamental em 2025 (IBGE Estados), são o principal espaço de difusão. O fator articula-se a E4-F09, E2-F30, E5-F04 e E6-F05, e o plano popular pode propor projetos escolares de monitoramento de criadouros, de nascentes e de focos de queimada com as comunidades.</w:t>
       </w:r>
       <w:proofErr w:type="spellStart"/>
-      <w:r>
-        <w:t>RAs</w:t>
-      </w:r>
       <w:proofErr w:type="spellEnd"/>
-      <w:r>
-        <w:t xml:space="preserve"> mais expostas, e sua abrangência não foi quantificada nesta versão. As escolas, com 354.373 matrículas no ensino fundamental em 2025 (IBGE Estados), são o principal espaço de difusão. O fator articula-se a E4-F09, E2-F30, E5-F04 e E6-F05, e o plano popular pode propor projetos escolares de monitoramento de criadouros, de nascentes e de focos de queimada com as comunidades.</w:t>
-      </w:r>
     </w:p>
     <w:tbl>
       <w:tblPr>
@@ -27250,28 +27188,12 @@
         <w:jc w:val="both"/>
       </w:pPr>
       <w:r>
-        <w:t xml:space="preserve">O acesso à cultura no Distrito Federal é condicionado pela concentração dos equipamentos culturais no Plano Piloto e pela distância e custo de deslocamento para os moradores das </w:t>
+        <w:t>O acesso à cultura no Distrito Federal é condicionado pela concentração dos equipamentos culturais no Plano Piloto e pela distância e custo de deslocamento para os moradores das RAs periféricas. Em 2021, 26,8% dos ocupados trabalhavam no Plano Piloto (IPEDF, PDAD 2021), mas o acesso a cinemas, teatros e museus fora do horário de trabalho depende do transporte coletivo, menos frequente à noite e nos fins de semana. A oferta de centros culturais, bibliotecas e espaços de convivência nas RAs de renda baixa é limitada. As festas populares, os eventos de rua e os espaços culturais comunitários suprem parcialmente essa ausência. O fator articula-se a E5-F17, E5-F23, E5-F27 e E5-F25.</w:t>
       </w:r>
       <w:proofErr w:type="spellStart"/>
-      <w:r>
-        <w:t>RAs</w:t>
-      </w:r>
       <w:proofErr w:type="spellEnd"/>
-      <w:r>
-        <w:t xml:space="preserve"> periféricas. Em 2021, 26,8% dos ocupados trabalhavam no Plano Piloto (IPEDF, PDAD 2021), mas o acesso a cinemas, teatros e museus fora do horário de trabalho depende do transporte coletivo, menos frequente à noite e nos fins de semana. A oferta de centros culturais, bibliotecas e espaços de convivência nas </w:t>
-      </w:r>
       <w:proofErr w:type="spellStart"/>
-      <w:r>
-        <w:t>RAs</w:t>
-      </w:r>
       <w:proofErr w:type="spellEnd"/>
-      <w:r>
-        <w:t xml:space="preserve"> de renda baixa é limitada e não foi quantificada por RA nesta versão. As festas populares, os eventos de rua e os espaços culturais comunitários suprem parcialmente essa ausência. O fator articula-se a E5-F17, E5-F23, E5-F27 e </w:t>
-      </w:r>
-      <w:r>
-        <w:lastRenderedPageBreak/>
-        <w:t>E5-F25, e o plano popular pode mapear os espaços culturais existentes e as lacunas por RA, propondo a descentralização de equipamentos e a gratuidade do transporte em eventos culturais.</w:t>
-      </w:r>
     </w:p>
     <w:tbl>
       <w:tblPr>
@@ -28810,24 +28732,12 @@
         <w:jc w:val="both"/>
       </w:pPr>
       <w:r>
-        <w:t xml:space="preserve">Os esportes no Distrito Federal são praticados em equipamentos públicos como os Pontos de Encontro Comunitário, quadras poliesportivas, centros olímpicos e o Parque da Cidade, e em projetos sociais esportivos nas </w:t>
+        <w:t>Os esportes no Distrito Federal são praticados em equipamentos públicos como os Pontos de Encontro Comunitário, quadras poliesportivas, centros olímpicos e o Parque da Cidade, e em projetos sociais esportivos nas RAs periféricas. Os Centros Olímpicos e Paralímpicos, distribuídos em RAs como Ceilândia, Samambaia, Gama, Planaltina e Recanto das Emas, oferecem atividades gratuitas. A prática de atividade física associa-se à prevenção de doenças crônicas, principais causas de morte no DF, e o calor e a baixa umidade na estiagem impõem cuidados para a prática ao ar livre, como evidenciado em 2024. O fator articula-se a E5-F28, E2-F09, E5-F25 e E2-F18, e o plano popular pode articular os programas esportivos às ações de promoção da saúde da APS e aos protocolos de calor e baixa umidade para atividades ao ar livre.</w:t>
       </w:r>
       <w:proofErr w:type="spellStart"/>
-      <w:r>
-        <w:t>RAs</w:t>
-      </w:r>
       <w:proofErr w:type="spellEnd"/>
-      <w:r>
-        <w:t xml:space="preserve"> periféricas. Os Centros Olímpicos e Paralímpicos, distribuídos em </w:t>
-      </w:r>
       <w:proofErr w:type="spellStart"/>
-      <w:r>
-        <w:t>RAs</w:t>
-      </w:r>
       <w:proofErr w:type="spellEnd"/>
-      <w:r>
-        <w:t xml:space="preserve"> como Ceilândia, Samambaia, Gama, Planaltina e Recanto das Emas, oferecem atividades gratuitas, mas sua cobertura em relação à população jovem não foi quantificada nesta versão. A prática de atividade física associa-se à prevenção de doenças crônicas, principais causas de morte no DF, e o calor e a baixa umidade na estiagem impõem cuidados para a prática ao ar livre, como evidenciado em 2024. O fator articula-se a E5-F28, E2-F09, E5-F25 e E2-F18, e o plano popular pode articular os programas esportivos às ações de promoção da saúde da APS e aos protocolos de calor e baixa umidade para atividades ao ar livre.</w:t>
-      </w:r>
     </w:p>
     <w:tbl>
       <w:tblPr>
@@ -29596,7 +29506,7 @@
         <w:jc w:val="both"/>
       </w:pPr>
       <w:r>
-        <w:t>O acesso à iluminação pública no Distrito Federal, de responsabilidade da Companhia Energética de Brasília em articulação com as administrações regionais, é amplo nas áreas consolidadas e deficiente nas ocupações irregulares, nas áreas rurais e em trechos de parques, passarelas e paradas de ônibus. A iluminação está associada à segurança, em especial das mulheres em trajetos noturnos, e à prevenção de atropelamentos nas vias que cortam áreas residenciais, onde os pedestres foram as principais vítimas fatais do trânsito em 2024, com 60 mortes (Detran-DF). A substituição por luminárias de LED avançou nos últimos anos, mas a cobertura por RA e os pontos com iluminação deficiente não foram sistematizados nesta versão. O fator articula-se a E2-F27, E3-F02, E5-F23 e E2-F11, e o plano popular pode organizar o mapeamento comunitário de pontos escuros nos trajetos entre moradias, paradas, escolas e UBS.</w:t>
+        <w:t>O acesso à iluminação pública no Distrito Federal, de responsabilidade da Companhia Energética de Brasília em articulação com as administrações regionais, é amplo nas áreas consolidadas e deficiente nas ocupações irregulares, nas áreas rurais e em trechos de parques, passarelas e paradas de ônibus. A iluminação está associada à segurança, em especial das mulheres em trajetos noturnos, e à prevenção de atropelamentos nas vias que cortam áreas residenciais, onde os pedestres foram as principais vítimas fatais do trânsito em 2024, com 60 mortes (Detran-DF). A substituição por luminárias de LED avançou nos últimos anos. O fator articula-se a E2-F27, E3-F02, E5-F23 e E2-F11, e o plano popular pode organizar o mapeamento comunitário de pontos escuros nos trajetos entre moradias, paradas, escolas e UBS.</w:t>
       </w:r>
     </w:p>
     <w:p>
@@ -31459,16 +31369,10 @@
         <w:jc w:val="both"/>
       </w:pPr>
       <w:r>
-        <w:t xml:space="preserve">A transparência ativa no Distrito Federal é exercida pelo Portal da Transparência do DF, pelo InfoSaúde-DF, pelos relatórios quadrimestrais da SES-DF, pelos anuários da SSP-DF, pela PDAD do IPEDF e pelos portais da Caesb, da </w:t>
+        <w:t>A transparência ativa no Distrito Federal é exercida pelo Portal da Transparência do DF, pelo InfoSaúde-DF, pelos relatórios quadrimestrais da SES-DF, pelos anuários da SSP-DF, pela PDAD do IPEDF e pelos portais da Caesb, da Adasa e do SLU. O DF realizou receitas de R$ 42,81 bilhões e empenhou despesas de R$ 44,10 bilhões em 2025 (IBGE, finanças públicas), e a SES-DF executou 71,04% da dotação autorizada de R$ 13,21 bilhões até o segundo quadrimestre de 2025 (SES-DF, 2º RDQA 2025). A transparência, contudo, raramente alcança a escala da Região Administrativa: orçamento, investimentos, indicadores de saúde e de risco não são publicados de forma sistemática por RA. O fator articula-se a E6-F08, E6-F07, E4-F09 e E1-F19, e o plano popular pode propor painel público com indicadores de saúde, ambiente, risco e investimento por RA.</w:t>
       </w:r>
       <w:proofErr w:type="spellStart"/>
-      <w:r>
-        <w:t>Adasa</w:t>
-      </w:r>
       <w:proofErr w:type="spellEnd"/>
-      <w:r>
-        <w:t xml:space="preserve"> e do SLU. O DF realizou receitas de R$ 42,81 bilhões e empenhou despesas de R$ 44,10 bilhões em 2025 (IBGE, finanças públicas), e a SES-DF executou 71,04% da dotação autorizada de R$ 13,21 bilhões até o segundo quadrimestre de 2025 (SES-DF, 2º RDQA 2025). A transparência, contudo, raramente alcança a escala da Região Administrativa: orçamento, investimentos, indicadores de saúde e de risco não são publicados de forma sistemática por RA, como evidenciam as lacunas deste diagnóstico. O fator articula-se a E6-F08, E6-F07, E4-F09 e E1-F19, e o plano popular pode propor painel público com indicadores de saúde, ambiente, risco e investimento por RA.</w:t>
-      </w:r>
     </w:p>
     <w:tbl>
       <w:tblPr>

</xml_diff>